<commit_message>
Update business rules and add diagram
</commit_message>
<xml_diff>
--- a/Guesthouse Platform Business rules.docx
+++ b/Guesthouse Platform Business rules.docx
@@ -346,8 +346,359 @@
           <w:lang w:val="en-GB"/>
         </w:rPr>
       </w:pPr>
+      <w:r>
+        <w:rPr>
+          <w:lang w:val="en-GB"/>
+        </w:rPr>
+        <w:t>ERD</w:t>
+      </w:r>
+    </w:p>
+    <w:tbl>
+      <w:tblPr>
+        <w:tblStyle w:val="TableGrid"/>
+        <w:tblW w:w="0" w:type="auto"/>
+        <w:tblLook w:val="04A0" w:firstRow="1" w:lastRow="0" w:firstColumn="1" w:lastColumn="0" w:noHBand="0" w:noVBand="1"/>
+      </w:tblPr>
+      <w:tblGrid>
+        <w:gridCol w:w="4675"/>
+        <w:gridCol w:w="4675"/>
+      </w:tblGrid>
+      <w:tr>
+        <w:tc>
+          <w:tcPr>
+            <w:tcW w:w="4675" w:type="dxa"/>
+          </w:tcPr>
+          <w:p>
+            <w:pPr>
+              <w:rPr>
+                <w:lang w:val="en-GB"/>
+              </w:rPr>
+            </w:pPr>
+            <w:r>
+              <w:rPr>
+                <w:lang w:val="en-GB"/>
+              </w:rPr>
+              <w:t>ENTITIES</w:t>
+            </w:r>
+          </w:p>
+        </w:tc>
+        <w:tc>
+          <w:tcPr>
+            <w:tcW w:w="4675" w:type="dxa"/>
+          </w:tcPr>
+          <w:p>
+            <w:pPr>
+              <w:rPr>
+                <w:lang w:val="en-GB"/>
+              </w:rPr>
+            </w:pPr>
+            <w:r>
+              <w:rPr>
+                <w:lang w:val="en-GB"/>
+              </w:rPr>
+              <w:t>ATTRIBUTES</w:t>
+            </w:r>
+          </w:p>
+        </w:tc>
+      </w:tr>
+      <w:tr>
+        <w:tc>
+          <w:tcPr>
+            <w:tcW w:w="4675" w:type="dxa"/>
+          </w:tcPr>
+          <w:p>
+            <w:pPr>
+              <w:rPr>
+                <w:lang w:val="en-GB"/>
+              </w:rPr>
+            </w:pPr>
+            <w:r>
+              <w:rPr>
+                <w:lang w:val="en-GB"/>
+              </w:rPr>
+              <w:t>Admin</w:t>
+            </w:r>
+          </w:p>
+        </w:tc>
+        <w:tc>
+          <w:tcPr>
+            <w:tcW w:w="4675" w:type="dxa"/>
+          </w:tcPr>
+          <w:p>
+            <w:pPr>
+              <w:rPr>
+                <w:lang w:val="en-GB"/>
+              </w:rPr>
+            </w:pPr>
+            <w:r>
+              <w:rPr>
+                <w:lang w:val="en-GB"/>
+              </w:rPr>
+              <w:t>Admin_id, Admin_name, Admin_email, Password_Hash</w:t>
+            </w:r>
+          </w:p>
+        </w:tc>
+      </w:tr>
+      <w:tr>
+        <w:tc>
+          <w:tcPr>
+            <w:tcW w:w="4675" w:type="dxa"/>
+          </w:tcPr>
+          <w:p>
+            <w:pPr>
+              <w:rPr>
+                <w:lang w:val="en-GB"/>
+              </w:rPr>
+            </w:pPr>
+            <w:r>
+              <w:rPr>
+                <w:lang w:val="en-GB"/>
+              </w:rPr>
+              <w:t>Customer</w:t>
+            </w:r>
+          </w:p>
+        </w:tc>
+        <w:tc>
+          <w:tcPr>
+            <w:tcW w:w="4675" w:type="dxa"/>
+          </w:tcPr>
+          <w:p>
+            <w:pPr>
+              <w:rPr>
+                <w:lang w:val="en-GB"/>
+              </w:rPr>
+            </w:pPr>
+            <w:r>
+              <w:rPr>
+                <w:lang w:val="en-GB"/>
+              </w:rPr>
+              <w:t>Customer_id, Customer_name, Customer_email, Password_Hash</w:t>
+            </w:r>
+          </w:p>
+        </w:tc>
+      </w:tr>
+      <w:tr>
+        <w:tc>
+          <w:tcPr>
+            <w:tcW w:w="4675" w:type="dxa"/>
+          </w:tcPr>
+          <w:p>
+            <w:pPr>
+              <w:rPr>
+                <w:lang w:val="en-GB"/>
+              </w:rPr>
+            </w:pPr>
+            <w:r>
+              <w:rPr>
+                <w:lang w:val="en-GB"/>
+              </w:rPr>
+              <w:t>Rating</w:t>
+            </w:r>
+          </w:p>
+        </w:tc>
+        <w:tc>
+          <w:tcPr>
+            <w:tcW w:w="4675" w:type="dxa"/>
+          </w:tcPr>
+          <w:p>
+            <w:pPr>
+              <w:rPr>
+                <w:lang w:val="en-GB"/>
+              </w:rPr>
+            </w:pPr>
+            <w:r>
+              <w:rPr>
+                <w:lang w:val="en-GB"/>
+              </w:rPr>
+              <w:t>Rating_id, Customer_id, Guesthouse_id, Comment, Rating</w:t>
+            </w:r>
+          </w:p>
+        </w:tc>
+      </w:tr>
+      <w:tr>
+        <w:tc>
+          <w:tcPr>
+            <w:tcW w:w="4675" w:type="dxa"/>
+          </w:tcPr>
+          <w:p>
+            <w:pPr>
+              <w:rPr>
+                <w:lang w:val="en-GB"/>
+              </w:rPr>
+            </w:pPr>
+            <w:r>
+              <w:rPr>
+                <w:lang w:val="en-GB"/>
+              </w:rPr>
+              <w:t>Favourites</w:t>
+            </w:r>
+          </w:p>
+        </w:tc>
+        <w:tc>
+          <w:tcPr>
+            <w:tcW w:w="4675" w:type="dxa"/>
+          </w:tcPr>
+          <w:p>
+            <w:pPr>
+              <w:rPr>
+                <w:lang w:val="en-GB"/>
+              </w:rPr>
+            </w:pPr>
+            <w:r>
+              <w:rPr>
+                <w:lang w:val="en-GB"/>
+              </w:rPr>
+              <w:t>Favourites_id, Guesthouse_id, Customer_id</w:t>
+            </w:r>
+          </w:p>
+        </w:tc>
+      </w:tr>
+      <w:tr>
+        <w:tc>
+          <w:tcPr>
+            <w:tcW w:w="4675" w:type="dxa"/>
+          </w:tcPr>
+          <w:p>
+            <w:pPr>
+              <w:rPr>
+                <w:lang w:val="en-GB"/>
+              </w:rPr>
+            </w:pPr>
+            <w:r>
+              <w:rPr>
+                <w:lang w:val="en-GB"/>
+              </w:rPr>
+              <w:lastRenderedPageBreak/>
+              <w:t>Guesthouse</w:t>
+            </w:r>
+          </w:p>
+        </w:tc>
+        <w:tc>
+          <w:tcPr>
+            <w:tcW w:w="4675" w:type="dxa"/>
+          </w:tcPr>
+          <w:p>
+            <w:pPr>
+              <w:rPr>
+                <w:lang w:val="en-GB"/>
+              </w:rPr>
+            </w:pPr>
+            <w:r>
+              <w:rPr>
+                <w:lang w:val="en-GB"/>
+              </w:rPr>
+              <w:t>Guesthouse id Guesthouse name, Guesthouse_Logo, Location, Contact details, Ratings, Favourites</w:t>
+            </w:r>
+          </w:p>
+        </w:tc>
+      </w:tr>
+    </w:tbl>
+    <w:p>
+      <w:pPr>
+        <w:rPr>
+          <w:lang w:val="en-GB"/>
+        </w:rPr>
+      </w:pPr>
+    </w:p>
+    <w:p>
+      <w:pPr>
+        <w:rPr>
+          <w:lang w:val="en-GB"/>
+        </w:rPr>
+      </w:pPr>
+    </w:p>
+    <w:p>
+      <w:pPr>
+        <w:rPr>
+          <w:lang w:val="en-GB"/>
+        </w:rPr>
+      </w:pPr>
+      <w:r>
+        <w:rPr>
+          <w:lang w:val="en-GB"/>
+        </w:rPr>
+        <w:t>RELATIONSHIP</w:t>
+      </w:r>
+    </w:p>
+    <w:p>
+      <w:pPr>
+        <w:rPr>
+          <w:lang w:val="en-GB"/>
+        </w:rPr>
+      </w:pPr>
+      <w:r>
+        <w:rPr>
+          <w:lang w:val="en-GB"/>
+        </w:rPr>
+        <w:t>Admin-Guesthouse—1:M</w:t>
+      </w:r>
+    </w:p>
+    <w:p>
+      <w:pPr>
+        <w:rPr>
+          <w:lang w:val="en-GB"/>
+        </w:rPr>
+      </w:pPr>
+      <w:r>
+        <w:rPr>
+          <w:lang w:val="en-GB"/>
+        </w:rPr>
+        <w:t>Customer-Rating—1:M</w:t>
+      </w:r>
+    </w:p>
+    <w:p>
+      <w:pPr>
+        <w:rPr>
+          <w:lang w:val="en-GB"/>
+        </w:rPr>
+      </w:pPr>
+      <w:r>
+        <w:rPr>
+          <w:lang w:val="en-GB"/>
+        </w:rPr>
+        <w:t>Guesthouse-Rating—1:M</w:t>
+      </w:r>
+    </w:p>
+    <w:p>
+      <w:pPr>
+        <w:rPr>
+          <w:lang w:val="en-GB"/>
+        </w:rPr>
+      </w:pPr>
+      <w:r>
+        <w:rPr>
+          <w:lang w:val="en-GB"/>
+        </w:rPr>
+        <w:t>Favourites-Customer—1:M</w:t>
+      </w:r>
+    </w:p>
+    <w:p>
+      <w:pPr>
+        <w:rPr>
+          <w:lang w:val="en-GB"/>
+        </w:rPr>
+      </w:pPr>
+      <w:r>
+        <w:rPr>
+          <w:lang w:val="en-GB"/>
+        </w:rPr>
+        <w:t>Guesthouse-Favourites—1:M</w:t>
+      </w:r>
+    </w:p>
+    <w:p>
+      <w:pPr>
+        <w:rPr>
+          <w:lang w:val="en-GB"/>
+        </w:rPr>
+      </w:pPr>
     </w:p>
     <w:sectPr>
+      <w:headerReference w:type="even" r:id="rId10"/>
+      <w:headerReference w:type="default" r:id="rId11"/>
+      <w:footerReference w:type="even" r:id="rId12"/>
+      <w:footerReference w:type="default" r:id="rId13"/>
+      <w:headerReference w:type="first" r:id="rId14"/>
+      <w:footerReference w:type="first" r:id="rId15"/>
       <w:pgSz w:w="12240" w:h="15840"/>
       <w:pgMar w:top="1440" w:right="1440" w:bottom="1440" w:left="1440" w:header="708" w:footer="708" w:gutter="0"/>
       <w:cols w:space="708"/>
@@ -355,6 +706,119 @@
     </w:sectPr>
   </w:body>
 </w:document>
+</file>
+
+<file path=word/endnotes.xml><?xml version="1.0" encoding="utf-8"?>
+<w:endnotes xmlns:wpc="http://schemas.microsoft.com/office/word/2010/wordprocessingCanvas" xmlns:cx="http://schemas.microsoft.com/office/drawing/2014/chartex" xmlns:cx1="http://schemas.microsoft.com/office/drawing/2015/9/8/chartex" xmlns:cx2="http://schemas.microsoft.com/office/drawing/2015/10/21/chartex" xmlns:cx3="http://schemas.microsoft.com/office/drawing/2016/5/9/chartex" xmlns:cx4="http://schemas.microsoft.com/office/drawing/2016/5/10/chartex" xmlns:cx5="http://schemas.microsoft.com/office/drawing/2016/5/11/chartex" xmlns:cx6="http://schemas.microsoft.com/office/drawing/2016/5/12/chartex" xmlns:cx7="http://schemas.microsoft.com/office/drawing/2016/5/13/chartex" xmlns:cx8="http://schemas.microsoft.com/office/drawing/2016/5/14/chartex" xmlns:mc="http://schemas.openxmlformats.org/markup-compatibility/2006" xmlns:aink="http://schemas.microsoft.com/office/drawing/2016/ink" xmlns:am3d="http://schemas.microsoft.com/office/drawing/2017/model3d" xmlns:o="urn:schemas-microsoft-com:office:office" xmlns:oel="http://schemas.microsoft.com/office/2019/extlst" xmlns:r="http://schemas.openxmlformats.org/officeDocument/2006/relationships" xmlns:m="http://schemas.openxmlformats.org/officeDocument/2006/math" xmlns:v="urn:schemas-microsoft-com:vml" xmlns:wp14="http://schemas.microsoft.com/office/word/2010/wordprocessingDrawing" xmlns:wp="http://schemas.openxmlformats.org/drawingml/2006/wordprocessingDrawing" xmlns:w10="urn:schemas-microsoft-com:office:word" xmlns:w="http://schemas.openxmlformats.org/wordprocessingml/2006/main" xmlns:w14="http://schemas.microsoft.com/office/word/2010/wordml" xmlns:w15="http://schemas.microsoft.com/office/word/2012/wordml" xmlns:w16cex="http://schemas.microsoft.com/office/word/2018/wordml/cex" xmlns:w16cid="http://schemas.microsoft.com/office/word/2016/wordml/cid" xmlns:w16="http://schemas.microsoft.com/office/word/2018/wordml" xmlns:w16du="http://schemas.microsoft.com/office/word/2023/wordml/word16du" xmlns:w16sdtdh="http://schemas.microsoft.com/office/word/2020/wordml/sdtdatahash" xmlns:w16sdtfl="http://schemas.microsoft.com/office/word/2024/wordml/sdtformatlock" xmlns:w16se="http://schemas.microsoft.com/office/word/2015/wordml/symex" xmlns:wpg="http://schemas.microsoft.com/office/word/2010/wordprocessingGroup" xmlns:wpi="http://schemas.microsoft.com/office/word/2010/wordprocessingInk" xmlns:wne="http://schemas.microsoft.com/office/word/2006/wordml" xmlns:wps="http://schemas.microsoft.com/office/word/2010/wordprocessingShape" mc:Ignorable="w14 w15 w16se w16cid w16 w16cex w16sdtdh w16sdtfl w16du wp14">
+  <w:endnote w:type="separator" w:id="-1">
+    <w:p>
+      <w:pPr>
+        <w:spacing w:after="0" w:line="240" w:lineRule="auto"/>
+      </w:pPr>
+      <w:r>
+        <w:separator/>
+      </w:r>
+    </w:p>
+  </w:endnote>
+  <w:endnote w:type="continuationSeparator" w:id="0">
+    <w:p>
+      <w:pPr>
+        <w:spacing w:after="0" w:line="240" w:lineRule="auto"/>
+      </w:pPr>
+      <w:r>
+        <w:continuationSeparator/>
+      </w:r>
+    </w:p>
+  </w:endnote>
+</w:endnotes>
+</file>
+
+<file path=word/footer1.xml><?xml version="1.0" encoding="utf-8"?>
+<w:ftr xmlns:wpc="http://schemas.microsoft.com/office/word/2010/wordprocessingCanvas" xmlns:cx="http://schemas.microsoft.com/office/drawing/2014/chartex" xmlns:cx1="http://schemas.microsoft.com/office/drawing/2015/9/8/chartex" xmlns:cx2="http://schemas.microsoft.com/office/drawing/2015/10/21/chartex" xmlns:cx3="http://schemas.microsoft.com/office/drawing/2016/5/9/chartex" xmlns:cx4="http://schemas.microsoft.com/office/drawing/2016/5/10/chartex" xmlns:cx5="http://schemas.microsoft.com/office/drawing/2016/5/11/chartex" xmlns:cx6="http://schemas.microsoft.com/office/drawing/2016/5/12/chartex" xmlns:cx7="http://schemas.microsoft.com/office/drawing/2016/5/13/chartex" xmlns:cx8="http://schemas.microsoft.com/office/drawing/2016/5/14/chartex" xmlns:mc="http://schemas.openxmlformats.org/markup-compatibility/2006" xmlns:aink="http://schemas.microsoft.com/office/drawing/2016/ink" xmlns:am3d="http://schemas.microsoft.com/office/drawing/2017/model3d" xmlns:o="urn:schemas-microsoft-com:office:office" xmlns:oel="http://schemas.microsoft.com/office/2019/extlst" xmlns:r="http://schemas.openxmlformats.org/officeDocument/2006/relationships" xmlns:m="http://schemas.openxmlformats.org/officeDocument/2006/math" xmlns:v="urn:schemas-microsoft-com:vml" xmlns:wp14="http://schemas.microsoft.com/office/word/2010/wordprocessingDrawing" xmlns:wp="http://schemas.openxmlformats.org/drawingml/2006/wordprocessingDrawing" xmlns:w10="urn:schemas-microsoft-com:office:word" xmlns:w="http://schemas.openxmlformats.org/wordprocessingml/2006/main" xmlns:w14="http://schemas.microsoft.com/office/word/2010/wordml" xmlns:w15="http://schemas.microsoft.com/office/word/2012/wordml" xmlns:w16cex="http://schemas.microsoft.com/office/word/2018/wordml/cex" xmlns:w16cid="http://schemas.microsoft.com/office/word/2016/wordml/cid" xmlns:w16="http://schemas.microsoft.com/office/word/2018/wordml" xmlns:w16du="http://schemas.microsoft.com/office/word/2023/wordml/word16du" xmlns:w16sdtdh="http://schemas.microsoft.com/office/word/2020/wordml/sdtdatahash" xmlns:w16sdtfl="http://schemas.microsoft.com/office/word/2024/wordml/sdtformatlock" xmlns:w16se="http://schemas.microsoft.com/office/word/2015/wordml/symex" xmlns:wpg="http://schemas.microsoft.com/office/word/2010/wordprocessingGroup" xmlns:wpi="http://schemas.microsoft.com/office/word/2010/wordprocessingInk" xmlns:wne="http://schemas.microsoft.com/office/word/2006/wordml" xmlns:wps="http://schemas.microsoft.com/office/word/2010/wordprocessingShape" mc:Ignorable="w14 w15 w16se w16cid w16 w16cex w16sdtdh w16sdtfl w16du wp14">
+  <w:p>
+    <w:pPr>
+      <w:pStyle w:val="Footer"/>
+    </w:pPr>
+  </w:p>
+</w:ftr>
+</file>
+
+<file path=word/footer2.xml><?xml version="1.0" encoding="utf-8"?>
+<w:ftr xmlns:wpc="http://schemas.microsoft.com/office/word/2010/wordprocessingCanvas" xmlns:cx="http://schemas.microsoft.com/office/drawing/2014/chartex" xmlns:cx1="http://schemas.microsoft.com/office/drawing/2015/9/8/chartex" xmlns:cx2="http://schemas.microsoft.com/office/drawing/2015/10/21/chartex" xmlns:cx3="http://schemas.microsoft.com/office/drawing/2016/5/9/chartex" xmlns:cx4="http://schemas.microsoft.com/office/drawing/2016/5/10/chartex" xmlns:cx5="http://schemas.microsoft.com/office/drawing/2016/5/11/chartex" xmlns:cx6="http://schemas.microsoft.com/office/drawing/2016/5/12/chartex" xmlns:cx7="http://schemas.microsoft.com/office/drawing/2016/5/13/chartex" xmlns:cx8="http://schemas.microsoft.com/office/drawing/2016/5/14/chartex" xmlns:mc="http://schemas.openxmlformats.org/markup-compatibility/2006" xmlns:aink="http://schemas.microsoft.com/office/drawing/2016/ink" xmlns:am3d="http://schemas.microsoft.com/office/drawing/2017/model3d" xmlns:o="urn:schemas-microsoft-com:office:office" xmlns:oel="http://schemas.microsoft.com/office/2019/extlst" xmlns:r="http://schemas.openxmlformats.org/officeDocument/2006/relationships" xmlns:m="http://schemas.openxmlformats.org/officeDocument/2006/math" xmlns:v="urn:schemas-microsoft-com:vml" xmlns:wp14="http://schemas.microsoft.com/office/word/2010/wordprocessingDrawing" xmlns:wp="http://schemas.openxmlformats.org/drawingml/2006/wordprocessingDrawing" xmlns:w10="urn:schemas-microsoft-com:office:word" xmlns:w="http://schemas.openxmlformats.org/wordprocessingml/2006/main" xmlns:w14="http://schemas.microsoft.com/office/word/2010/wordml" xmlns:w15="http://schemas.microsoft.com/office/word/2012/wordml" xmlns:w16cex="http://schemas.microsoft.com/office/word/2018/wordml/cex" xmlns:w16cid="http://schemas.microsoft.com/office/word/2016/wordml/cid" xmlns:w16="http://schemas.microsoft.com/office/word/2018/wordml" xmlns:w16du="http://schemas.microsoft.com/office/word/2023/wordml/word16du" xmlns:w16sdtdh="http://schemas.microsoft.com/office/word/2020/wordml/sdtdatahash" xmlns:w16sdtfl="http://schemas.microsoft.com/office/word/2024/wordml/sdtformatlock" xmlns:w16se="http://schemas.microsoft.com/office/word/2015/wordml/symex" xmlns:wpg="http://schemas.microsoft.com/office/word/2010/wordprocessingGroup" xmlns:wpi="http://schemas.microsoft.com/office/word/2010/wordprocessingInk" xmlns:wne="http://schemas.microsoft.com/office/word/2006/wordml" xmlns:wps="http://schemas.microsoft.com/office/word/2010/wordprocessingShape" mc:Ignorable="w14 w15 w16se w16cid w16 w16cex w16sdtdh w16sdtfl w16du wp14">
+  <w:p>
+    <w:pPr>
+      <w:pStyle w:val="Footer"/>
+      <w:rPr>
+        <w:lang w:val="en-GB"/>
+      </w:rPr>
+    </w:pPr>
+  </w:p>
+</w:ftr>
+</file>
+
+<file path=word/footer3.xml><?xml version="1.0" encoding="utf-8"?>
+<w:ftr xmlns:wpc="http://schemas.microsoft.com/office/word/2010/wordprocessingCanvas" xmlns:cx="http://schemas.microsoft.com/office/drawing/2014/chartex" xmlns:cx1="http://schemas.microsoft.com/office/drawing/2015/9/8/chartex" xmlns:cx2="http://schemas.microsoft.com/office/drawing/2015/10/21/chartex" xmlns:cx3="http://schemas.microsoft.com/office/drawing/2016/5/9/chartex" xmlns:cx4="http://schemas.microsoft.com/office/drawing/2016/5/10/chartex" xmlns:cx5="http://schemas.microsoft.com/office/drawing/2016/5/11/chartex" xmlns:cx6="http://schemas.microsoft.com/office/drawing/2016/5/12/chartex" xmlns:cx7="http://schemas.microsoft.com/office/drawing/2016/5/13/chartex" xmlns:cx8="http://schemas.microsoft.com/office/drawing/2016/5/14/chartex" xmlns:mc="http://schemas.openxmlformats.org/markup-compatibility/2006" xmlns:aink="http://schemas.microsoft.com/office/drawing/2016/ink" xmlns:am3d="http://schemas.microsoft.com/office/drawing/2017/model3d" xmlns:o="urn:schemas-microsoft-com:office:office" xmlns:oel="http://schemas.microsoft.com/office/2019/extlst" xmlns:r="http://schemas.openxmlformats.org/officeDocument/2006/relationships" xmlns:m="http://schemas.openxmlformats.org/officeDocument/2006/math" xmlns:v="urn:schemas-microsoft-com:vml" xmlns:wp14="http://schemas.microsoft.com/office/word/2010/wordprocessingDrawing" xmlns:wp="http://schemas.openxmlformats.org/drawingml/2006/wordprocessingDrawing" xmlns:w10="urn:schemas-microsoft-com:office:word" xmlns:w="http://schemas.openxmlformats.org/wordprocessingml/2006/main" xmlns:w14="http://schemas.microsoft.com/office/word/2010/wordml" xmlns:w15="http://schemas.microsoft.com/office/word/2012/wordml" xmlns:w16cex="http://schemas.microsoft.com/office/word/2018/wordml/cex" xmlns:w16cid="http://schemas.microsoft.com/office/word/2016/wordml/cid" xmlns:w16="http://schemas.microsoft.com/office/word/2018/wordml" xmlns:w16du="http://schemas.microsoft.com/office/word/2023/wordml/word16du" xmlns:w16sdtdh="http://schemas.microsoft.com/office/word/2020/wordml/sdtdatahash" xmlns:w16sdtfl="http://schemas.microsoft.com/office/word/2024/wordml/sdtformatlock" xmlns:w16se="http://schemas.microsoft.com/office/word/2015/wordml/symex" xmlns:wpg="http://schemas.microsoft.com/office/word/2010/wordprocessingGroup" xmlns:wpi="http://schemas.microsoft.com/office/word/2010/wordprocessingInk" xmlns:wne="http://schemas.microsoft.com/office/word/2006/wordml" xmlns:wps="http://schemas.microsoft.com/office/word/2010/wordprocessingShape" mc:Ignorable="w14 w15 w16se w16cid w16 w16cex w16sdtdh w16sdtfl w16du wp14">
+  <w:p>
+    <w:pPr>
+      <w:pStyle w:val="Footer"/>
+    </w:pPr>
+  </w:p>
+</w:ftr>
+</file>
+
+<file path=word/footnotes.xml><?xml version="1.0" encoding="utf-8"?>
+<w:footnotes xmlns:wpc="http://schemas.microsoft.com/office/word/2010/wordprocessingCanvas" xmlns:cx="http://schemas.microsoft.com/office/drawing/2014/chartex" xmlns:cx1="http://schemas.microsoft.com/office/drawing/2015/9/8/chartex" xmlns:cx2="http://schemas.microsoft.com/office/drawing/2015/10/21/chartex" xmlns:cx3="http://schemas.microsoft.com/office/drawing/2016/5/9/chartex" xmlns:cx4="http://schemas.microsoft.com/office/drawing/2016/5/10/chartex" xmlns:cx5="http://schemas.microsoft.com/office/drawing/2016/5/11/chartex" xmlns:cx6="http://schemas.microsoft.com/office/drawing/2016/5/12/chartex" xmlns:cx7="http://schemas.microsoft.com/office/drawing/2016/5/13/chartex" xmlns:cx8="http://schemas.microsoft.com/office/drawing/2016/5/14/chartex" xmlns:mc="http://schemas.openxmlformats.org/markup-compatibility/2006" xmlns:aink="http://schemas.microsoft.com/office/drawing/2016/ink" xmlns:am3d="http://schemas.microsoft.com/office/drawing/2017/model3d" xmlns:o="urn:schemas-microsoft-com:office:office" xmlns:oel="http://schemas.microsoft.com/office/2019/extlst" xmlns:r="http://schemas.openxmlformats.org/officeDocument/2006/relationships" xmlns:m="http://schemas.openxmlformats.org/officeDocument/2006/math" xmlns:v="urn:schemas-microsoft-com:vml" xmlns:wp14="http://schemas.microsoft.com/office/word/2010/wordprocessingDrawing" xmlns:wp="http://schemas.openxmlformats.org/drawingml/2006/wordprocessingDrawing" xmlns:w10="urn:schemas-microsoft-com:office:word" xmlns:w="http://schemas.openxmlformats.org/wordprocessingml/2006/main" xmlns:w14="http://schemas.microsoft.com/office/word/2010/wordml" xmlns:w15="http://schemas.microsoft.com/office/word/2012/wordml" xmlns:w16cex="http://schemas.microsoft.com/office/word/2018/wordml/cex" xmlns:w16cid="http://schemas.microsoft.com/office/word/2016/wordml/cid" xmlns:w16="http://schemas.microsoft.com/office/word/2018/wordml" xmlns:w16du="http://schemas.microsoft.com/office/word/2023/wordml/word16du" xmlns:w16sdtdh="http://schemas.microsoft.com/office/word/2020/wordml/sdtdatahash" xmlns:w16sdtfl="http://schemas.microsoft.com/office/word/2024/wordml/sdtformatlock" xmlns:w16se="http://schemas.microsoft.com/office/word/2015/wordml/symex" xmlns:wpg="http://schemas.microsoft.com/office/word/2010/wordprocessingGroup" xmlns:wpi="http://schemas.microsoft.com/office/word/2010/wordprocessingInk" xmlns:wne="http://schemas.microsoft.com/office/word/2006/wordml" xmlns:wps="http://schemas.microsoft.com/office/word/2010/wordprocessingShape" mc:Ignorable="w14 w15 w16se w16cid w16 w16cex w16sdtdh w16sdtfl w16du wp14">
+  <w:footnote w:type="separator" w:id="-1">
+    <w:p>
+      <w:pPr>
+        <w:spacing w:after="0" w:line="240" w:lineRule="auto"/>
+      </w:pPr>
+      <w:r>
+        <w:separator/>
+      </w:r>
+    </w:p>
+  </w:footnote>
+  <w:footnote w:type="continuationSeparator" w:id="0">
+    <w:p>
+      <w:pPr>
+        <w:spacing w:after="0" w:line="240" w:lineRule="auto"/>
+      </w:pPr>
+      <w:r>
+        <w:continuationSeparator/>
+      </w:r>
+    </w:p>
+  </w:footnote>
+</w:footnotes>
+</file>
+
+<file path=word/header1.xml><?xml version="1.0" encoding="utf-8"?>
+<w:hdr xmlns:wpc="http://schemas.microsoft.com/office/word/2010/wordprocessingCanvas" xmlns:cx="http://schemas.microsoft.com/office/drawing/2014/chartex" xmlns:cx1="http://schemas.microsoft.com/office/drawing/2015/9/8/chartex" xmlns:cx2="http://schemas.microsoft.com/office/drawing/2015/10/21/chartex" xmlns:cx3="http://schemas.microsoft.com/office/drawing/2016/5/9/chartex" xmlns:cx4="http://schemas.microsoft.com/office/drawing/2016/5/10/chartex" xmlns:cx5="http://schemas.microsoft.com/office/drawing/2016/5/11/chartex" xmlns:cx6="http://schemas.microsoft.com/office/drawing/2016/5/12/chartex" xmlns:cx7="http://schemas.microsoft.com/office/drawing/2016/5/13/chartex" xmlns:cx8="http://schemas.microsoft.com/office/drawing/2016/5/14/chartex" xmlns:mc="http://schemas.openxmlformats.org/markup-compatibility/2006" xmlns:aink="http://schemas.microsoft.com/office/drawing/2016/ink" xmlns:am3d="http://schemas.microsoft.com/office/drawing/2017/model3d" xmlns:o="urn:schemas-microsoft-com:office:office" xmlns:oel="http://schemas.microsoft.com/office/2019/extlst" xmlns:r="http://schemas.openxmlformats.org/officeDocument/2006/relationships" xmlns:m="http://schemas.openxmlformats.org/officeDocument/2006/math" xmlns:v="urn:schemas-microsoft-com:vml" xmlns:wp14="http://schemas.microsoft.com/office/word/2010/wordprocessingDrawing" xmlns:wp="http://schemas.openxmlformats.org/drawingml/2006/wordprocessingDrawing" xmlns:w10="urn:schemas-microsoft-com:office:word" xmlns:w="http://schemas.openxmlformats.org/wordprocessingml/2006/main" xmlns:w14="http://schemas.microsoft.com/office/word/2010/wordml" xmlns:w15="http://schemas.microsoft.com/office/word/2012/wordml" xmlns:w16cex="http://schemas.microsoft.com/office/word/2018/wordml/cex" xmlns:w16cid="http://schemas.microsoft.com/office/word/2016/wordml/cid" xmlns:w16="http://schemas.microsoft.com/office/word/2018/wordml" xmlns:w16du="http://schemas.microsoft.com/office/word/2023/wordml/word16du" xmlns:w16sdtdh="http://schemas.microsoft.com/office/word/2020/wordml/sdtdatahash" xmlns:w16sdtfl="http://schemas.microsoft.com/office/word/2024/wordml/sdtformatlock" xmlns:w16se="http://schemas.microsoft.com/office/word/2015/wordml/symex" xmlns:wpg="http://schemas.microsoft.com/office/word/2010/wordprocessingGroup" xmlns:wpi="http://schemas.microsoft.com/office/word/2010/wordprocessingInk" xmlns:wne="http://schemas.microsoft.com/office/word/2006/wordml" xmlns:wps="http://schemas.microsoft.com/office/word/2010/wordprocessingShape" mc:Ignorable="w14 w15 w16se w16cid w16 w16cex w16sdtdh w16sdtfl w16du wp14">
+  <w:p>
+    <w:pPr>
+      <w:pStyle w:val="Header"/>
+    </w:pPr>
+  </w:p>
+</w:hdr>
+</file>
+
+<file path=word/header2.xml><?xml version="1.0" encoding="utf-8"?>
+<w:hdr xmlns:wpc="http://schemas.microsoft.com/office/word/2010/wordprocessingCanvas" xmlns:cx="http://schemas.microsoft.com/office/drawing/2014/chartex" xmlns:cx1="http://schemas.microsoft.com/office/drawing/2015/9/8/chartex" xmlns:cx2="http://schemas.microsoft.com/office/drawing/2015/10/21/chartex" xmlns:cx3="http://schemas.microsoft.com/office/drawing/2016/5/9/chartex" xmlns:cx4="http://schemas.microsoft.com/office/drawing/2016/5/10/chartex" xmlns:cx5="http://schemas.microsoft.com/office/drawing/2016/5/11/chartex" xmlns:cx6="http://schemas.microsoft.com/office/drawing/2016/5/12/chartex" xmlns:cx7="http://schemas.microsoft.com/office/drawing/2016/5/13/chartex" xmlns:cx8="http://schemas.microsoft.com/office/drawing/2016/5/14/chartex" xmlns:mc="http://schemas.openxmlformats.org/markup-compatibility/2006" xmlns:aink="http://schemas.microsoft.com/office/drawing/2016/ink" xmlns:am3d="http://schemas.microsoft.com/office/drawing/2017/model3d" xmlns:o="urn:schemas-microsoft-com:office:office" xmlns:oel="http://schemas.microsoft.com/office/2019/extlst" xmlns:r="http://schemas.openxmlformats.org/officeDocument/2006/relationships" xmlns:m="http://schemas.openxmlformats.org/officeDocument/2006/math" xmlns:v="urn:schemas-microsoft-com:vml" xmlns:wp14="http://schemas.microsoft.com/office/word/2010/wordprocessingDrawing" xmlns:wp="http://schemas.openxmlformats.org/drawingml/2006/wordprocessingDrawing" xmlns:w10="urn:schemas-microsoft-com:office:word" xmlns:w="http://schemas.openxmlformats.org/wordprocessingml/2006/main" xmlns:w14="http://schemas.microsoft.com/office/word/2010/wordml" xmlns:w15="http://schemas.microsoft.com/office/word/2012/wordml" xmlns:w16cex="http://schemas.microsoft.com/office/word/2018/wordml/cex" xmlns:w16cid="http://schemas.microsoft.com/office/word/2016/wordml/cid" xmlns:w16="http://schemas.microsoft.com/office/word/2018/wordml" xmlns:w16du="http://schemas.microsoft.com/office/word/2023/wordml/word16du" xmlns:w16sdtdh="http://schemas.microsoft.com/office/word/2020/wordml/sdtdatahash" xmlns:w16sdtfl="http://schemas.microsoft.com/office/word/2024/wordml/sdtformatlock" xmlns:w16se="http://schemas.microsoft.com/office/word/2015/wordml/symex" xmlns:wpg="http://schemas.microsoft.com/office/word/2010/wordprocessingGroup" xmlns:wpi="http://schemas.microsoft.com/office/word/2010/wordprocessingInk" xmlns:wne="http://schemas.microsoft.com/office/word/2006/wordml" xmlns:wps="http://schemas.microsoft.com/office/word/2010/wordprocessingShape" mc:Ignorable="w14 w15 w16se w16cid w16 w16cex w16sdtdh w16sdtfl w16du wp14">
+  <w:p>
+    <w:pPr>
+      <w:pStyle w:val="Header"/>
+    </w:pPr>
+  </w:p>
+</w:hdr>
+</file>
+
+<file path=word/header3.xml><?xml version="1.0" encoding="utf-8"?>
+<w:hdr xmlns:wpc="http://schemas.microsoft.com/office/word/2010/wordprocessingCanvas" xmlns:cx="http://schemas.microsoft.com/office/drawing/2014/chartex" xmlns:cx1="http://schemas.microsoft.com/office/drawing/2015/9/8/chartex" xmlns:cx2="http://schemas.microsoft.com/office/drawing/2015/10/21/chartex" xmlns:cx3="http://schemas.microsoft.com/office/drawing/2016/5/9/chartex" xmlns:cx4="http://schemas.microsoft.com/office/drawing/2016/5/10/chartex" xmlns:cx5="http://schemas.microsoft.com/office/drawing/2016/5/11/chartex" xmlns:cx6="http://schemas.microsoft.com/office/drawing/2016/5/12/chartex" xmlns:cx7="http://schemas.microsoft.com/office/drawing/2016/5/13/chartex" xmlns:cx8="http://schemas.microsoft.com/office/drawing/2016/5/14/chartex" xmlns:mc="http://schemas.openxmlformats.org/markup-compatibility/2006" xmlns:aink="http://schemas.microsoft.com/office/drawing/2016/ink" xmlns:am3d="http://schemas.microsoft.com/office/drawing/2017/model3d" xmlns:o="urn:schemas-microsoft-com:office:office" xmlns:oel="http://schemas.microsoft.com/office/2019/extlst" xmlns:r="http://schemas.openxmlformats.org/officeDocument/2006/relationships" xmlns:m="http://schemas.openxmlformats.org/officeDocument/2006/math" xmlns:v="urn:schemas-microsoft-com:vml" xmlns:wp14="http://schemas.microsoft.com/office/word/2010/wordprocessingDrawing" xmlns:wp="http://schemas.openxmlformats.org/drawingml/2006/wordprocessingDrawing" xmlns:w10="urn:schemas-microsoft-com:office:word" xmlns:w="http://schemas.openxmlformats.org/wordprocessingml/2006/main" xmlns:w14="http://schemas.microsoft.com/office/word/2010/wordml" xmlns:w15="http://schemas.microsoft.com/office/word/2012/wordml" xmlns:w16cex="http://schemas.microsoft.com/office/word/2018/wordml/cex" xmlns:w16cid="http://schemas.microsoft.com/office/word/2016/wordml/cid" xmlns:w16="http://schemas.microsoft.com/office/word/2018/wordml" xmlns:w16du="http://schemas.microsoft.com/office/word/2023/wordml/word16du" xmlns:w16sdtdh="http://schemas.microsoft.com/office/word/2020/wordml/sdtdatahash" xmlns:w16sdtfl="http://schemas.microsoft.com/office/word/2024/wordml/sdtformatlock" xmlns:w16se="http://schemas.microsoft.com/office/word/2015/wordml/symex" xmlns:wpg="http://schemas.microsoft.com/office/word/2010/wordprocessingGroup" xmlns:wpi="http://schemas.microsoft.com/office/word/2010/wordprocessingInk" xmlns:wne="http://schemas.microsoft.com/office/word/2006/wordml" xmlns:wps="http://schemas.microsoft.com/office/word/2010/wordprocessingShape" mc:Ignorable="w14 w15 w16se w16cid w16 w16cex w16sdtdh w16sdtfl w16du wp14">
+  <w:p>
+    <w:pPr>
+      <w:pStyle w:val="Header"/>
+    </w:pPr>
+  </w:p>
+</w:hdr>
 </file>
 
 <file path=word/numbering.xml><?xml version="1.0" encoding="utf-8"?>
@@ -1371,6 +1835,69 @@
       <w:spacing w:val="5"/>
     </w:rPr>
   </w:style>
+  <w:style w:type="table" w:styleId="TableGrid">
+    <w:name w:val="Table Grid"/>
+    <w:basedOn w:val="TableNormal"/>
+    <w:uiPriority w:val="39"/>
+    <w:rsid w:val="00BD354D"/>
+    <w:pPr>
+      <w:spacing w:after="0" w:line="240" w:lineRule="auto"/>
+    </w:pPr>
+    <w:tblPr>
+      <w:tblBorders>
+        <w:top w:val="single" w:sz="4" w:space="0" w:color="auto"/>
+        <w:left w:val="single" w:sz="4" w:space="0" w:color="auto"/>
+        <w:bottom w:val="single" w:sz="4" w:space="0" w:color="auto"/>
+        <w:right w:val="single" w:sz="4" w:space="0" w:color="auto"/>
+        <w:insideH w:val="single" w:sz="4" w:space="0" w:color="auto"/>
+        <w:insideV w:val="single" w:sz="4" w:space="0" w:color="auto"/>
+      </w:tblBorders>
+    </w:tblPr>
+  </w:style>
+  <w:style w:type="paragraph" w:styleId="Header">
+    <w:name w:val="header"/>
+    <w:basedOn w:val="Normal"/>
+    <w:link w:val="HeaderChar"/>
+    <w:uiPriority w:val="99"/>
+    <w:unhideWhenUsed/>
+    <w:rsid w:val="008A503C"/>
+    <w:pPr>
+      <w:tabs>
+        <w:tab w:val="center" w:pos="4680"/>
+        <w:tab w:val="right" w:pos="9360"/>
+      </w:tabs>
+      <w:spacing w:after="0" w:line="240" w:lineRule="auto"/>
+    </w:pPr>
+  </w:style>
+  <w:style w:type="character" w:customStyle="1" w:styleId="HeaderChar">
+    <w:name w:val="Header Char"/>
+    <w:basedOn w:val="DefaultParagraphFont"/>
+    <w:link w:val="Header"/>
+    <w:uiPriority w:val="99"/>
+    <w:rsid w:val="008A503C"/>
+  </w:style>
+  <w:style w:type="paragraph" w:styleId="Footer">
+    <w:name w:val="footer"/>
+    <w:basedOn w:val="Normal"/>
+    <w:link w:val="FooterChar"/>
+    <w:uiPriority w:val="99"/>
+    <w:unhideWhenUsed/>
+    <w:rsid w:val="008A503C"/>
+    <w:pPr>
+      <w:tabs>
+        <w:tab w:val="center" w:pos="4680"/>
+        <w:tab w:val="right" w:pos="9360"/>
+      </w:tabs>
+      <w:spacing w:after="0" w:line="240" w:lineRule="auto"/>
+    </w:pPr>
+  </w:style>
+  <w:style w:type="character" w:customStyle="1" w:styleId="FooterChar">
+    <w:name w:val="Footer Char"/>
+    <w:basedOn w:val="DefaultParagraphFont"/>
+    <w:link w:val="Footer"/>
+    <w:uiPriority w:val="99"/>
+    <w:rsid w:val="008A503C"/>
+  </w:style>
 </w:styles>
 </file>
 
@@ -1690,6 +2217,23 @@
 </file>
 
 <file path=customXml/item1.xml><?xml version="1.0" encoding="utf-8"?>
+<p:properties xmlns:p="http://schemas.microsoft.com/office/2006/metadata/properties" xmlns:xsi="http://www.w3.org/2001/XMLSchema-instance" xmlns:pc="http://schemas.microsoft.com/office/infopath/2007/PartnerControls">
+  <documentManagement>
+    <_activity xmlns="8d1c6790-8c2f-42d0-8608-17118dd9979f" xsi:nil="true"/>
+  </documentManagement>
+</p:properties>
+</file>
+
+<file path=customXml/item2.xml><?xml version="1.0" encoding="utf-8"?>
+<?mso-contentType ?>
+<FormTemplates xmlns="http://schemas.microsoft.com/sharepoint/v3/contenttype/forms">
+  <Display>DocumentLibraryForm</Display>
+  <Edit>DocumentLibraryForm</Edit>
+  <New>DocumentLibraryForm</New>
+</FormTemplates>
+</file>
+
+<file path=customXml/item3.xml><?xml version="1.0" encoding="utf-8"?>
 <ct:contentTypeSchema xmlns:ct="http://schemas.microsoft.com/office/2006/metadata/contentType" xmlns:ma="http://schemas.microsoft.com/office/2006/metadata/properties/metaAttributes" ct:_="" ma:_="" ma:contentTypeName="Document" ma:contentTypeID="0x010100ECA57AA9E96DBB4D8B44AF41B5DF87E1" ma:contentTypeVersion="6" ma:contentTypeDescription="Create a new document." ma:contentTypeScope="" ma:versionID="7b6fd6e4da5f755e3cc8ee73162f3439">
   <xsd:schema xmlns:xsd="http://www.w3.org/2001/XMLSchema" xmlns:xs="http://www.w3.org/2001/XMLSchema" xmlns:p="http://schemas.microsoft.com/office/2006/metadata/properties" xmlns:ns3="8d1c6790-8c2f-42d0-8608-17118dd9979f" targetNamespace="http://schemas.microsoft.com/office/2006/metadata/properties" ma:root="true" ma:fieldsID="a4f19947eaa0bfc3322a3babec3551f5" ns3:_="">
     <xsd:import namespace="8d1c6790-8c2f-42d0-8608-17118dd9979f"/>
@@ -1845,24 +2389,25 @@
 </ct:contentTypeSchema>
 </file>
 
-<file path=customXml/item2.xml><?xml version="1.0" encoding="utf-8"?>
-<?mso-contentType ?>
-<FormTemplates xmlns="http://schemas.microsoft.com/sharepoint/v3/contenttype/forms">
-  <Display>DocumentLibraryForm</Display>
-  <Edit>DocumentLibraryForm</Edit>
-  <New>DocumentLibraryForm</New>
-</FormTemplates>
+<file path=customXml/itemProps1.xml><?xml version="1.0" encoding="utf-8"?>
+<ds:datastoreItem xmlns:ds="http://schemas.openxmlformats.org/officeDocument/2006/customXml" ds:itemID="{44BA6C18-61EB-473F-B390-F6A8FDA764F1}">
+  <ds:schemaRefs>
+    <ds:schemaRef ds:uri="http://schemas.microsoft.com/office/2006/metadata/properties"/>
+    <ds:schemaRef ds:uri="http://schemas.microsoft.com/office/infopath/2007/PartnerControls"/>
+    <ds:schemaRef ds:uri="8d1c6790-8c2f-42d0-8608-17118dd9979f"/>
+  </ds:schemaRefs>
+</ds:datastoreItem>
 </file>
 
-<file path=customXml/item3.xml><?xml version="1.0" encoding="utf-8"?>
-<p:properties xmlns:p="http://schemas.microsoft.com/office/2006/metadata/properties" xmlns:xsi="http://www.w3.org/2001/XMLSchema-instance" xmlns:pc="http://schemas.microsoft.com/office/infopath/2007/PartnerControls">
-  <documentManagement>
-    <_activity xmlns="8d1c6790-8c2f-42d0-8608-17118dd9979f" xsi:nil="true"/>
-  </documentManagement>
-</p:properties>
+<file path=customXml/itemProps2.xml><?xml version="1.0" encoding="utf-8"?>
+<ds:datastoreItem xmlns:ds="http://schemas.openxmlformats.org/officeDocument/2006/customXml" ds:itemID="{8A86F22A-A3F8-4BB1-AA09-193E0DFDBF6E}">
+  <ds:schemaRefs>
+    <ds:schemaRef ds:uri="http://schemas.microsoft.com/sharepoint/v3/contenttype/forms"/>
+  </ds:schemaRefs>
+</ds:datastoreItem>
 </file>
 
-<file path=customXml/itemProps1.xml><?xml version="1.0" encoding="utf-8"?>
+<file path=customXml/itemProps3.xml><?xml version="1.0" encoding="utf-8"?>
 <ds:datastoreItem xmlns:ds="http://schemas.openxmlformats.org/officeDocument/2006/customXml" ds:itemID="{7B4CA1B1-9B30-497A-9CF7-0ABFCF44B7D1}">
   <ds:schemaRefs>
     <ds:schemaRef ds:uri="http://schemas.microsoft.com/office/2006/metadata/contentType"/>
@@ -1878,22 +2423,4 @@
     <ds:schemaRef ds:uri="http://schemas.microsoft.com/internal/obd"/>
   </ds:schemaRefs>
 </ds:datastoreItem>
-</file>
-
-<file path=customXml/itemProps2.xml><?xml version="1.0" encoding="utf-8"?>
-<ds:datastoreItem xmlns:ds="http://schemas.openxmlformats.org/officeDocument/2006/customXml" ds:itemID="{8A86F22A-A3F8-4BB1-AA09-193E0DFDBF6E}">
-  <ds:schemaRefs>
-    <ds:schemaRef ds:uri="http://schemas.microsoft.com/sharepoint/v3/contenttype/forms"/>
-  </ds:schemaRefs>
-</ds:datastoreItem>
-</file>
-
-<file path=customXml/itemProps3.xml><?xml version="1.0" encoding="utf-8"?>
-<ds:datastoreItem xmlns:ds="http://schemas.openxmlformats.org/officeDocument/2006/customXml" ds:itemID="{44BA6C18-61EB-473F-B390-F6A8FDA764F1}">
-  <ds:schemaRefs>
-    <ds:schemaRef ds:uri="http://schemas.microsoft.com/office/2006/metadata/properties"/>
-    <ds:schemaRef ds:uri="http://schemas.microsoft.com/office/infopath/2007/PartnerControls"/>
-    <ds:schemaRef ds:uri="8d1c6790-8c2f-42d0-8608-17118dd9979f"/>
-  </ds:schemaRefs>
-</ds:datastoreItem>
 </file>
</xml_diff>